<commit_message>
Implement section authority management and document upload functionality
Co-authored-by: Copilot <copilot@github.com>
</commit_message>
<xml_diff>
--- a/text_editor_client/src/assets/Exampel doc.docx
+++ b/text_editor_client/src/assets/Exampel doc.docx
@@ -146,86 +146,155 @@
     <w:p>
       <w:pPr>
         <w:pStyle w:val="Heading1"/>
-      </w:pPr>
-      <w:r>
-        <w:t xml:space="preserve"> Kiến trúc tổng thể</w:t>
+        <w:rPr>
+          <w:lang w:val="vi-VN"/>
+        </w:rPr>
+      </w:pPr>
+      <w:r>
+        <w:t xml:space="preserve"> </w:t>
+      </w:r>
+      <w:r>
+        <w:rPr>
+          <w:lang w:val="vi-VN"/>
+        </w:rPr>
+        <w:t xml:space="preserve">1 </w:t>
+      </w:r>
+      <w:r>
+        <w:t>Kiến trúc tổng thể</w:t>
       </w:r>
     </w:p>
     <w:p>
       <w:pPr>
         <w:pStyle w:val="Heading2"/>
-      </w:pPr>
+        <w:rPr>
+          <w:lang w:val="vi-VN"/>
+        </w:rPr>
+      </w:pPr>
+      <w:r>
+        <w:rPr>
+          <w:lang w:val="vi-VN"/>
+        </w:rPr>
+        <w:t xml:space="preserve">1.2 </w:t>
+      </w:r>
       <w:r>
         <w:t>Frontend</w:t>
       </w:r>
-    </w:p>
-    <w:p>
-      <w:pPr>
-        <w:numPr>
-          <w:ilvl w:val="0"/>
-          <w:numId w:val="2"/>
-        </w:numPr>
-        <w:rPr>
-          <w:rFonts w:ascii="Times New Roman" w:hAnsi="Times New Roman" w:cs="Times New Roman"/>
-        </w:rPr>
-      </w:pPr>
-      <w:r>
-        <w:rPr>
-          <w:rFonts w:ascii="Times New Roman" w:hAnsi="Times New Roman" w:cs="Times New Roman"/>
-        </w:rPr>
+      <w:r>
+        <w:rPr>
+          <w:lang w:val="vi-VN"/>
+        </w:rPr>
+        <w:t xml:space="preserve"> </w:t>
+      </w:r>
+    </w:p>
+    <w:p>
+      <w:pPr>
+        <w:pStyle w:val="Heading3"/>
+        <w:rPr>
+          <w:lang w:val="vi-VN"/>
+        </w:rPr>
+      </w:pPr>
+      <w:r>
         <w:t>Sử dụng Document Editor của Syncfusion</w:t>
       </w:r>
     </w:p>
     <w:p>
       <w:pPr>
-        <w:numPr>
-          <w:ilvl w:val="0"/>
-          <w:numId w:val="2"/>
-        </w:numPr>
-        <w:rPr>
-          <w:rFonts w:ascii="Times New Roman" w:hAnsi="Times New Roman" w:cs="Times New Roman"/>
-        </w:rPr>
-      </w:pPr>
-      <w:r>
-        <w:rPr>
-          <w:rFonts w:ascii="Times New Roman" w:hAnsi="Times New Roman" w:cs="Times New Roman"/>
-        </w:rPr>
+        <w:rPr>
+          <w:lang w:val="vi-VN"/>
+        </w:rPr>
+      </w:pPr>
+      <w:r>
+        <w:rPr>
+          <w:lang w:val="vi-VN"/>
+        </w:rPr>
+        <w:t>Nọi dung gì ấ</w:t>
+      </w:r>
+    </w:p>
+    <w:p>
+      <w:pPr>
+        <w:pStyle w:val="Heading3"/>
+        <w:rPr>
+          <w:lang w:val="vi-VN"/>
+        </w:rPr>
+      </w:pPr>
+      <w:r>
         <w:t>Hiển thị document theo từng section</w:t>
       </w:r>
     </w:p>
     <w:p>
       <w:pPr>
-        <w:numPr>
-          <w:ilvl w:val="0"/>
-          <w:numId w:val="2"/>
-        </w:numPr>
-        <w:rPr>
-          <w:rFonts w:ascii="Times New Roman" w:hAnsi="Times New Roman" w:cs="Times New Roman"/>
-        </w:rPr>
-      </w:pPr>
-      <w:r>
-        <w:rPr>
-          <w:rFonts w:ascii="Times New Roman" w:hAnsi="Times New Roman" w:cs="Times New Roman"/>
-        </w:rPr>
+        <w:rPr>
+          <w:lang w:val="vi-VN"/>
+        </w:rPr>
+      </w:pPr>
+      <w:r>
+        <w:rPr>
+          <w:lang w:val="vi-VN"/>
+        </w:rPr>
+        <w:t>Nọi dung gì ấ</w:t>
+      </w:r>
+    </w:p>
+    <w:p>
+      <w:pPr>
+        <w:pStyle w:val="Heading3"/>
+        <w:rPr>
+          <w:lang w:val="vi-VN"/>
+        </w:rPr>
+      </w:pPr>
+      <w:r>
         <w:t>Chỉ cho phép edit section được phân quyền</w:t>
       </w:r>
     </w:p>
     <w:p>
       <w:pPr>
-        <w:numPr>
-          <w:ilvl w:val="0"/>
-          <w:numId w:val="2"/>
-        </w:numPr>
-        <w:rPr>
-          <w:rFonts w:ascii="Times New Roman" w:hAnsi="Times New Roman" w:cs="Times New Roman"/>
-        </w:rPr>
-      </w:pPr>
-      <w:r>
-        <w:rPr>
-          <w:rFonts w:ascii="Times New Roman" w:hAnsi="Times New Roman" w:cs="Times New Roman"/>
-        </w:rPr>
+        <w:rPr>
+          <w:lang w:val="vi-VN"/>
+        </w:rPr>
+      </w:pPr>
+      <w:r>
+        <w:rPr>
+          <w:lang w:val="vi-VN"/>
+        </w:rPr>
+        <w:t>Nọi dung gì ấ</w:t>
+      </w:r>
+    </w:p>
+    <w:p>
+      <w:pPr>
+        <w:rPr>
+          <w:lang w:val="vi-VN"/>
+        </w:rPr>
+      </w:pPr>
+    </w:p>
+    <w:p>
+      <w:pPr>
+        <w:pStyle w:val="Heading3"/>
+        <w:rPr>
+          <w:lang w:val="vi-VN"/>
+        </w:rPr>
+      </w:pPr>
+      <w:r>
         <w:t>Kết nối realtime qua SignalR</w:t>
       </w:r>
+    </w:p>
+    <w:p>
+      <w:pPr>
+        <w:rPr>
+          <w:lang w:val="vi-VN"/>
+        </w:rPr>
+      </w:pPr>
+      <w:r>
+        <w:rPr>
+          <w:lang w:val="vi-VN"/>
+        </w:rPr>
+        <w:t>Nọi dung gì ấ</w:t>
+      </w:r>
+    </w:p>
+    <w:p>
+      <w:pPr>
+        <w:rPr>
+          <w:lang w:val="vi-VN"/>
+        </w:rPr>
+      </w:pPr>
     </w:p>
     <w:p>
       <w:pPr>
@@ -317,7 +386,6 @@
         <w:rPr>
           <w:rFonts w:ascii="Times New Roman" w:hAnsi="Times New Roman" w:cs="Times New Roman"/>
         </w:rPr>
-        <w:lastRenderedPageBreak/>
         <w:t>kiểm tra quyền</w:t>
       </w:r>
     </w:p>
@@ -475,6 +543,7 @@
         <w:rPr>
           <w:rFonts w:ascii="Times New Roman" w:hAnsi="Times New Roman" w:cs="Times New Roman"/>
         </w:rPr>
+        <w:lastRenderedPageBreak/>
         <w:pict w14:anchorId="12268B65">
           <v:rect id="_x0000_i1026" style="width:0;height:1.5pt" o:hralign="center" o:hrstd="t" o:hr="t" fillcolor="#a0a0a0" stroked="f"/>
         </w:pict>
@@ -713,7 +782,6 @@
         <w:rPr>
           <w:rFonts w:ascii="Times New Roman" w:hAnsi="Times New Roman" w:cs="Times New Roman"/>
         </w:rPr>
-        <w:lastRenderedPageBreak/>
         <w:t>UserId</w:t>
       </w:r>
     </w:p>
@@ -848,6 +916,7 @@
         <w:rPr>
           <w:rFonts w:ascii="Times New Roman" w:hAnsi="Times New Roman" w:cs="Times New Roman"/>
         </w:rPr>
+        <w:lastRenderedPageBreak/>
         <w:t>Lưu mỗi section thành 1 record riêng</w:t>
       </w:r>
     </w:p>
@@ -1096,7 +1165,6 @@
         <w:pStyle w:val="Heading2"/>
       </w:pPr>
       <w:r>
-        <w:lastRenderedPageBreak/>
         <w:t xml:space="preserve"> Conflict Handling</w:t>
       </w:r>
     </w:p>
@@ -1256,6 +1324,7 @@
         <w:pStyle w:val="Heading2"/>
       </w:pPr>
       <w:r>
+        <w:lastRenderedPageBreak/>
         <w:t>Lưu dữ liệu</w:t>
       </w:r>
     </w:p>
@@ -1530,7 +1599,6 @@
         <w:rPr>
           <w:rFonts w:ascii="Times New Roman" w:hAnsi="Times New Roman" w:cs="Times New Roman"/>
         </w:rPr>
-        <w:lastRenderedPageBreak/>
         <w:pict w14:anchorId="0EEA95D0">
           <v:rect id="_x0000_i1031" style="width:0;height:1.5pt" o:hralign="center" o:hrstd="t" o:hr="t" fillcolor="#a0a0a0" stroked="f"/>
         </w:pict>
@@ -1694,6 +1762,7 @@
         <w:rPr>
           <w:rFonts w:ascii="Times New Roman" w:hAnsi="Times New Roman" w:cs="Times New Roman"/>
         </w:rPr>
+        <w:lastRenderedPageBreak/>
         <w:t>update editor realtime</w:t>
       </w:r>
     </w:p>
@@ -2001,7 +2070,6 @@
         <w:rPr>
           <w:rFonts w:ascii="Times New Roman" w:hAnsi="Times New Roman" w:cs="Times New Roman"/>
         </w:rPr>
-        <w:lastRenderedPageBreak/>
         <w:t>Frontend: Syncfusion Document Editor</w:t>
       </w:r>
     </w:p>
@@ -2159,6 +2227,7 @@
           <w:b/>
           <w:bCs/>
         </w:rPr>
+        <w:lastRenderedPageBreak/>
         <w:t>✅</w:t>
       </w:r>
       <w:r>
@@ -2477,7 +2546,6 @@
         <w:rPr>
           <w:rFonts w:ascii="Times New Roman" w:hAnsi="Times New Roman" w:cs="Times New Roman"/>
         </w:rPr>
-        <w:lastRenderedPageBreak/>
         <w:t xml:space="preserve">chỉ edit section được phép </w:t>
       </w:r>
     </w:p>
@@ -6640,6 +6708,7 @@
   <w:style w:type="paragraph" w:default="1" w:styleId="Normal">
     <w:name w:val="Normal"/>
     <w:qFormat/>
+    <w:rsid w:val="004A1E0A"/>
   </w:style>
   <w:style w:type="paragraph" w:styleId="Heading1">
     <w:name w:val="heading 1"/>
@@ -6690,7 +6759,6 @@
     <w:next w:val="Normal"/>
     <w:link w:val="Heading3Char"/>
     <w:uiPriority w:val="9"/>
-    <w:semiHidden/>
     <w:unhideWhenUsed/>
     <w:qFormat/>
     <w:rsid w:val="00EF389C"/>
@@ -6897,7 +6965,6 @@
     <w:basedOn w:val="DefaultParagraphFont"/>
     <w:link w:val="Heading3"/>
     <w:uiPriority w:val="9"/>
-    <w:semiHidden/>
     <w:rsid w:val="00EF389C"/>
     <w:rPr>
       <w:rFonts w:eastAsiaTheme="majorEastAsia" w:cstheme="majorBidi"/>

</xml_diff>